<commit_message>
Add initial script and asset guidelines for S0 scene "冷开场：月痕" in 《斗萝大陆》
</commit_message>
<xml_diff>
--- a/doc/剧情设计/开局/斗萝大陆_分场脚本_S0_冷开场_月痕_V1.0.docx
+++ b/doc/剧情设计/开局/斗萝大陆_分场脚本_S0_冷开场_月痕_V1.0.docx
@@ -5562,176 +5562,6 @@
         <w:t>视频统一负面提示词：角色换脸、发色变化、耳朵消失或增生、服装变化、年龄变化、身高比例漂移、额外人物、可见怪物、镜头抖动、快速推拉、肢体穿模、错误手指、嘴型乱动、暖金主光、完整魔法阵、爆炸、文字、水印、logo、UI。</w:t>
       </w:r>
     </w:p>
-    <w:p>
-      <w:pPr>
-        <w:spacing w:before="280" w:after="140" w:line="264" w:lineRule="auto"/>
-      </w:pPr>
-      <w:r>
-        <w:rPr>
-          <w:rFonts w:ascii="Microsoft YaHei" w:hAnsi="Microsoft YaHei" w:eastAsia="Microsoft YaHei"/>
-          <w:b/>
-          <w:i w:val="0"/>
-          <w:color w:val="2E5E78"/>
-          <w:sz w:val="30"/>
-        </w:rPr>
-        <w:t>九、场次验收</w:t>
-      </w:r>
-    </w:p>
-    <w:p>
-      <w:pPr>
-        <w:pStyle w:val="ListNumber"/>
-        <w:spacing w:before="0" w:after="80" w:line="283" w:lineRule="auto"/>
-      </w:pPr>
-      <w:r>
-        <w:rPr>
-          <w:rFonts w:ascii="Microsoft YaHei" w:hAnsi="Microsoft YaHei" w:eastAsia="Microsoft YaHei"/>
-          <w:b w:val="0"/>
-          <w:i w:val="0"/>
-          <w:color w:val="172033"/>
-          <w:sz w:val="20"/>
-        </w:rPr>
-        <w:t>总时长落在60–120秒，默认剪辑约90秒。</w:t>
-      </w:r>
-    </w:p>
-    <w:p>
-      <w:pPr>
-        <w:pStyle w:val="ListNumber"/>
-        <w:spacing w:before="0" w:after="80" w:line="283" w:lineRule="auto"/>
-      </w:pPr>
-      <w:r>
-        <w:rPr>
-          <w:rFonts w:ascii="Microsoft YaHei" w:hAnsi="Microsoft YaHei" w:eastAsia="Microsoft YaHei"/>
-          <w:b w:val="0"/>
-          <w:i w:val="0"/>
-          <w:color w:val="172033"/>
-          <w:sz w:val="20"/>
-        </w:rPr>
-        <w:t>清楚读出露娜负伤、雾流反常、古树刻痕异常和未知威胁未现身。</w:t>
-      </w:r>
-    </w:p>
-    <w:p>
-      <w:pPr>
-        <w:pStyle w:val="ListNumber"/>
-        <w:spacing w:before="0" w:after="80" w:line="283" w:lineRule="auto"/>
-      </w:pPr>
-      <w:r>
-        <w:rPr>
-          <w:rFonts w:ascii="Microsoft YaHei" w:hAnsi="Microsoft YaHei" w:eastAsia="Microsoft YaHei"/>
-          <w:b w:val="0"/>
-          <w:i w:val="0"/>
-          <w:color w:val="172033"/>
-          <w:sz w:val="20"/>
-        </w:rPr>
-        <w:t>三句V2.0关键对白、白光切黑、村钟和结尾字幕均保留。</w:t>
-      </w:r>
-    </w:p>
-    <w:p>
-      <w:pPr>
-        <w:pStyle w:val="ListNumber"/>
-        <w:spacing w:before="0" w:after="80" w:line="283" w:lineRule="auto"/>
-      </w:pPr>
-      <w:r>
-        <w:rPr>
-          <w:rFonts w:ascii="Microsoft YaHei" w:hAnsi="Microsoft YaHei" w:eastAsia="Microsoft YaHei"/>
-          <w:b w:val="0"/>
-          <w:i w:val="0"/>
-          <w:color w:val="172033"/>
-          <w:sz w:val="20"/>
-        </w:rPr>
-        <w:t>露娜始终体现判断与守护，不出现求救化或卖萌化表演。</w:t>
-      </w:r>
-    </w:p>
-    <w:p>
-      <w:pPr>
-        <w:pStyle w:val="ListNumber"/>
-        <w:spacing w:before="0" w:after="80" w:line="283" w:lineRule="auto"/>
-      </w:pPr>
-      <w:r>
-        <w:rPr>
-          <w:rFonts w:ascii="Microsoft YaHei" w:hAnsi="Microsoft YaHei" w:eastAsia="Microsoft YaHei"/>
-          <w:b w:val="0"/>
-          <w:i w:val="0"/>
-          <w:color w:val="172033"/>
-          <w:sz w:val="20"/>
-        </w:rPr>
-        <w:t>未提前泄露幕后者、源萝之力、月痕全貌、任务、奖励和契约。</w:t>
-      </w:r>
-    </w:p>
-    <w:p>
-      <w:pPr>
-        <w:pStyle w:val="ListNumber"/>
-        <w:spacing w:before="0" w:after="80" w:line="283" w:lineRule="auto"/>
-      </w:pPr>
-      <w:r>
-        <w:rPr>
-          <w:rFonts w:ascii="Microsoft YaHei" w:hAnsi="Microsoft YaHei" w:eastAsia="Microsoft YaHei"/>
-          <w:b w:val="0"/>
-          <w:i w:val="0"/>
-          <w:color w:val="172033"/>
-          <w:sz w:val="20"/>
-        </w:rPr>
-        <w:t>跳过后无状态丢失、重复结算、黑屏停滞或村钟重复。</w:t>
-      </w:r>
-    </w:p>
-    <w:tbl>
-      <w:tblPr>
-        <w:tblW w:type="dxa" w:w="9360"/>
-        <w:jc w:val="left"/>
-        <w:tblLayout w:type="fixed"/>
-        <w:tblLook w:firstColumn="1" w:firstRow="1" w:lastColumn="0" w:lastRow="0" w:noHBand="0" w:noVBand="1" w:val="04A0"/>
-        <w:tblInd w:w="120" w:type="dxa"/>
-        <w:tblBorders>
-          <w:top w:val="single" w:sz="4" w:space="0" w:color="D3DEE5"/>
-          <w:left w:val="single" w:sz="4" w:space="0" w:color="D3DEE5"/>
-          <w:bottom w:val="single" w:sz="4" w:space="0" w:color="D3DEE5"/>
-          <w:right w:val="single" w:sz="4" w:space="0" w:color="D3DEE5"/>
-          <w:insideH w:val="single" w:sz="4" w:space="0" w:color="D3DEE5"/>
-          <w:insideV w:val="single" w:sz="4" w:space="0" w:color="D3DEE5"/>
-        </w:tblBorders>
-      </w:tblPr>
-      <w:tblGrid>
-        <w:gridCol w:w="9360"/>
-      </w:tblGrid>
-      <w:tr>
-        <w:tc>
-          <w:tcPr>
-            <w:tcW w:type="dxa" w:w="9360"/>
-            <w:shd w:fill="F8ECEE"/>
-            <w:tcMar>
-              <w:top w:w="130" w:type="dxa"/>
-              <w:start w:w="160" w:type="dxa"/>
-              <w:bottom w:w="130" w:type="dxa"/>
-              <w:end w:w="160" w:type="dxa"/>
-            </w:tcMar>
-          </w:tcPr>
-          <w:p>
-            <w:pPr>
-              <w:spacing w:before="0" w:after="0" w:line="288" w:lineRule="auto"/>
-            </w:pPr>
-            <w:r>
-              <w:rPr>
-                <w:rFonts w:ascii="Microsoft YaHei" w:hAnsi="Microsoft YaHei" w:eastAsia="Microsoft YaHei"/>
-                <w:b/>
-                <w:i w:val="0"/>
-                <w:color w:val="8E2F3C"/>
-                <w:sz w:val="20"/>
-              </w:rPr>
-              <w:t xml:space="preserve">上线阻断 </w:t>
-            </w:r>
-            <w:r>
-              <w:rPr>
-                <w:rFonts w:ascii="Microsoft YaHei" w:hAnsi="Microsoft YaHei" w:eastAsia="Microsoft YaHei"/>
-                <w:b w:val="0"/>
-                <w:i w:val="0"/>
-                <w:color w:val="172033"/>
-                <w:sz w:val="20"/>
-              </w:rPr>
-              <w:t>如果无法清楚表现“树梢风向与贴地雾向相反”，或将负伤实体露娜误画成卡灵投影，本场叙事机制不成立。</w:t>
-            </w:r>
-          </w:p>
-        </w:tc>
-      </w:tr>
-    </w:tbl>
     <w:sectPr>
       <w:footerReference w:type="default" r:id="rId9"/>
       <w:pgSz w:w="12240" w:h="15840"/>

</xml_diff>